<commit_message>
Completed - REST - Country Web Service in Spring REST using Spring Boot 3
</commit_message>
<xml_diff>
--- a/Week 3/Spring REST using Spring Boot 3/spring-learn/2.Spring Handson Output.docx
+++ b/Week 3/Spring REST using Spring Boot 3/spring-learn/2.Spring Handson Output.docx
@@ -13,8 +13,11 @@
         </w:rPr>
       </w:pPr>
       <w:r>
+        <w:rPr>
+          <w:noProof/>
+        </w:rPr>
         <w:drawing>
-          <wp:anchor distT="0" distB="0" distL="114300" distR="114300" simplePos="0" relativeHeight="251658240" behindDoc="0" locked="0" layoutInCell="1" allowOverlap="1" wp14:anchorId="019CFF1A" wp14:editId="752B4838">
+          <wp:anchor distT="0" distB="0" distL="114300" distR="114300" simplePos="0" relativeHeight="251658240" behindDoc="0" locked="0" layoutInCell="1" allowOverlap="1" wp14:anchorId="019CFF1A" wp14:editId="474A391B">
             <wp:simplePos x="0" y="0"/>
             <wp:positionH relativeFrom="margin">
               <wp:align>center</wp:align>
@@ -89,6 +92,9 @@
     <w:p/>
     <w:p>
       <w:r>
+        <w:rPr>
+          <w:noProof/>
+        </w:rPr>
         <w:drawing>
           <wp:inline distT="0" distB="0" distL="0" distR="0" wp14:anchorId="7D90FBB1" wp14:editId="42023656">
             <wp:extent cx="5731510" cy="2420620"/>
@@ -128,6 +134,9 @@
     </w:p>
     <w:p>
       <w:r>
+        <w:rPr>
+          <w:noProof/>
+        </w:rPr>
         <w:lastRenderedPageBreak/>
         <w:drawing>
           <wp:inline distT="0" distB="0" distL="0" distR="0" wp14:anchorId="3DA70E2D" wp14:editId="5CF838D8">
@@ -187,6 +196,150 @@
     <w:p/>
     <w:p/>
     <w:p/>
+    <w:p/>
+    <w:p>
+      <w:r>
+        <w:rPr>
+          <w:rFonts w:ascii="Arial" w:eastAsia="Times New Roman" w:hAnsi="Arial" w:cs="Arial"/>
+          <w:b/>
+          <w:bCs/>
+          <w:color w:val="333333"/>
+          <w:sz w:val="36"/>
+          <w:szCs w:val="36"/>
+          <w:shd w:val="clear" w:color="auto" w:fill="FFFFFF"/>
+        </w:rPr>
+        <w:lastRenderedPageBreak/>
+        <w:t>REST - Country Web Service</w:t>
+      </w:r>
+      <w:r>
+        <w:rPr>
+          <w:rFonts w:ascii="Arial" w:eastAsia="Times New Roman" w:hAnsi="Arial" w:cs="Arial"/>
+          <w:color w:val="333333"/>
+          <w:sz w:val="21"/>
+          <w:szCs w:val="21"/>
+          <w:shd w:val="clear" w:color="auto" w:fill="FFFFFF"/>
+        </w:rPr>
+        <w:t> </w:t>
+      </w:r>
+    </w:p>
+    <w:p>
+      <w:r>
+        <w:drawing>
+          <wp:inline distT="0" distB="0" distL="0" distR="0" wp14:anchorId="3530CA5F" wp14:editId="5BF25886">
+            <wp:extent cx="5731510" cy="3084195"/>
+            <wp:effectExtent l="0" t="0" r="2540" b="1905"/>
+            <wp:docPr id="1397147018" name="Picture 1"/>
+            <wp:cNvGraphicFramePr>
+              <a:graphicFrameLocks xmlns:a="http://schemas.openxmlformats.org/drawingml/2006/main" noChangeAspect="1"/>
+            </wp:cNvGraphicFramePr>
+            <a:graphic xmlns:a="http://schemas.openxmlformats.org/drawingml/2006/main">
+              <a:graphicData uri="http://schemas.openxmlformats.org/drawingml/2006/picture">
+                <pic:pic xmlns:pic="http://schemas.openxmlformats.org/drawingml/2006/picture">
+                  <pic:nvPicPr>
+                    <pic:cNvPr id="1397147018" name=""/>
+                    <pic:cNvPicPr/>
+                  </pic:nvPicPr>
+                  <pic:blipFill>
+                    <a:blip r:embed="rId7"/>
+                    <a:stretch>
+                      <a:fillRect/>
+                    </a:stretch>
+                  </pic:blipFill>
+                  <pic:spPr>
+                    <a:xfrm>
+                      <a:off x="0" y="0"/>
+                      <a:ext cx="5731510" cy="3084195"/>
+                    </a:xfrm>
+                    <a:prstGeom prst="rect">
+                      <a:avLst/>
+                    </a:prstGeom>
+                  </pic:spPr>
+                </pic:pic>
+              </a:graphicData>
+            </a:graphic>
+          </wp:inline>
+        </w:drawing>
+      </w:r>
+    </w:p>
+    <w:p/>
+    <w:p>
+      <w:r>
+        <w:drawing>
+          <wp:inline distT="0" distB="0" distL="0" distR="0" wp14:anchorId="2D20117A" wp14:editId="489D178B">
+            <wp:extent cx="5731510" cy="2477770"/>
+            <wp:effectExtent l="0" t="0" r="2540" b="0"/>
+            <wp:docPr id="2104828362" name="Picture 1"/>
+            <wp:cNvGraphicFramePr>
+              <a:graphicFrameLocks xmlns:a="http://schemas.openxmlformats.org/drawingml/2006/main" noChangeAspect="1"/>
+            </wp:cNvGraphicFramePr>
+            <a:graphic xmlns:a="http://schemas.openxmlformats.org/drawingml/2006/main">
+              <a:graphicData uri="http://schemas.openxmlformats.org/drawingml/2006/picture">
+                <pic:pic xmlns:pic="http://schemas.openxmlformats.org/drawingml/2006/picture">
+                  <pic:nvPicPr>
+                    <pic:cNvPr id="2104828362" name=""/>
+                    <pic:cNvPicPr/>
+                  </pic:nvPicPr>
+                  <pic:blipFill>
+                    <a:blip r:embed="rId8"/>
+                    <a:stretch>
+                      <a:fillRect/>
+                    </a:stretch>
+                  </pic:blipFill>
+                  <pic:spPr>
+                    <a:xfrm>
+                      <a:off x="0" y="0"/>
+                      <a:ext cx="5731510" cy="2477770"/>
+                    </a:xfrm>
+                    <a:prstGeom prst="rect">
+                      <a:avLst/>
+                    </a:prstGeom>
+                  </pic:spPr>
+                </pic:pic>
+              </a:graphicData>
+            </a:graphic>
+          </wp:inline>
+        </w:drawing>
+      </w:r>
+    </w:p>
+    <w:p>
+      <w:r>
+        <w:drawing>
+          <wp:inline distT="0" distB="0" distL="0" distR="0" wp14:anchorId="64C2EDF1" wp14:editId="4B16DDDD">
+            <wp:extent cx="5731510" cy="2373630"/>
+            <wp:effectExtent l="0" t="0" r="2540" b="7620"/>
+            <wp:docPr id="2122434649" name="Picture 1"/>
+            <wp:cNvGraphicFramePr>
+              <a:graphicFrameLocks xmlns:a="http://schemas.openxmlformats.org/drawingml/2006/main" noChangeAspect="1"/>
+            </wp:cNvGraphicFramePr>
+            <a:graphic xmlns:a="http://schemas.openxmlformats.org/drawingml/2006/main">
+              <a:graphicData uri="http://schemas.openxmlformats.org/drawingml/2006/picture">
+                <pic:pic xmlns:pic="http://schemas.openxmlformats.org/drawingml/2006/picture">
+                  <pic:nvPicPr>
+                    <pic:cNvPr id="2122434649" name=""/>
+                    <pic:cNvPicPr/>
+                  </pic:nvPicPr>
+                  <pic:blipFill>
+                    <a:blip r:embed="rId9"/>
+                    <a:stretch>
+                      <a:fillRect/>
+                    </a:stretch>
+                  </pic:blipFill>
+                  <pic:spPr>
+                    <a:xfrm>
+                      <a:off x="0" y="0"/>
+                      <a:ext cx="5731510" cy="2373630"/>
+                    </a:xfrm>
+                    <a:prstGeom prst="rect">
+                      <a:avLst/>
+                    </a:prstGeom>
+                  </pic:spPr>
+                </pic:pic>
+              </a:graphicData>
+            </a:graphic>
+          </wp:inline>
+        </w:drawing>
+      </w:r>
+    </w:p>
     <w:sectPr>
       <w:pgSz w:w="11906" w:h="16838"/>
       <w:pgMar w:top="1440" w:right="1440" w:bottom="1440" w:left="1440" w:header="708" w:footer="708" w:gutter="0"/>
@@ -800,6 +953,7 @@
   <w:style w:type="character" w:default="1" w:styleId="DefaultParagraphFont">
     <w:name w:val="Default Paragraph Font"/>
     <w:uiPriority w:val="1"/>
+    <w:semiHidden/>
     <w:unhideWhenUsed/>
   </w:style>
   <w:style w:type="table" w:default="1" w:styleId="TableNormal">

</xml_diff>

<commit_message>
Completed - REST - Get country based on country code in Spring REST using Spring Boot 3
</commit_message>
<xml_diff>
--- a/Week 3/Spring REST using Spring Boot 3/spring-learn/2.Spring Handson Output.docx
+++ b/Week 3/Spring REST using Spring Boot 3/spring-learn/2.Spring Handson Output.docx
@@ -17,7 +17,7 @@
           <w:noProof/>
         </w:rPr>
         <w:drawing>
-          <wp:anchor distT="0" distB="0" distL="114300" distR="114300" simplePos="0" relativeHeight="251658240" behindDoc="0" locked="0" layoutInCell="1" allowOverlap="1" wp14:anchorId="019CFF1A" wp14:editId="474A391B">
+          <wp:anchor distT="0" distB="0" distL="114300" distR="114300" simplePos="0" relativeHeight="251658240" behindDoc="0" locked="0" layoutInCell="1" allowOverlap="1" wp14:anchorId="019CFF1A" wp14:editId="4B6DE762">
             <wp:simplePos x="0" y="0"/>
             <wp:positionH relativeFrom="margin">
               <wp:align>center</wp:align>
@@ -224,6 +224,9 @@
     </w:p>
     <w:p>
       <w:r>
+        <w:rPr>
+          <w:noProof/>
+        </w:rPr>
         <w:drawing>
           <wp:inline distT="0" distB="0" distL="0" distR="0" wp14:anchorId="3530CA5F" wp14:editId="5BF25886">
             <wp:extent cx="5731510" cy="3084195"/>
@@ -264,6 +267,9 @@
     <w:p/>
     <w:p>
       <w:r>
+        <w:rPr>
+          <w:noProof/>
+        </w:rPr>
         <w:drawing>
           <wp:inline distT="0" distB="0" distL="0" distR="0" wp14:anchorId="2D20117A" wp14:editId="489D178B">
             <wp:extent cx="5731510" cy="2477770"/>
@@ -303,6 +309,9 @@
     </w:p>
     <w:p>
       <w:r>
+        <w:rPr>
+          <w:noProof/>
+        </w:rPr>
         <w:drawing>
           <wp:inline distT="0" distB="0" distL="0" distR="0" wp14:anchorId="64C2EDF1" wp14:editId="4B16DDDD">
             <wp:extent cx="5731510" cy="2373630"/>
@@ -328,6 +337,275 @@
                     <a:xfrm>
                       <a:off x="0" y="0"/>
                       <a:ext cx="5731510" cy="2373630"/>
+                    </a:xfrm>
+                    <a:prstGeom prst="rect">
+                      <a:avLst/>
+                    </a:prstGeom>
+                  </pic:spPr>
+                </pic:pic>
+              </a:graphicData>
+            </a:graphic>
+          </wp:inline>
+        </w:drawing>
+      </w:r>
+    </w:p>
+    <w:p>
+      <w:r>
+        <w:rPr>
+          <w:rFonts w:ascii="Arial" w:eastAsia="Times New Roman" w:hAnsi="Arial" w:cs="Arial"/>
+          <w:b/>
+          <w:bCs/>
+          <w:color w:val="333333"/>
+          <w:sz w:val="36"/>
+          <w:szCs w:val="36"/>
+          <w:shd w:val="clear" w:color="auto" w:fill="FFFFFF"/>
+        </w:rPr>
+        <w:lastRenderedPageBreak/>
+        <w:t>REST - Get country based on country code</w:t>
+      </w:r>
+      <w:r>
+        <w:rPr>
+          <w:rFonts w:ascii="Arial" w:eastAsia="Times New Roman" w:hAnsi="Arial" w:cs="Arial"/>
+          <w:color w:val="333333"/>
+          <w:sz w:val="21"/>
+          <w:szCs w:val="21"/>
+          <w:shd w:val="clear" w:color="auto" w:fill="FFFFFF"/>
+        </w:rPr>
+        <w:t> </w:t>
+      </w:r>
+    </w:p>
+    <w:p>
+      <w:r>
+        <w:drawing>
+          <wp:inline distT="0" distB="0" distL="0" distR="0" wp14:anchorId="79E704B8" wp14:editId="41E691AB">
+            <wp:extent cx="5731510" cy="1649730"/>
+            <wp:effectExtent l="0" t="0" r="2540" b="7620"/>
+            <wp:docPr id="1021222726" name="Picture 1"/>
+            <wp:cNvGraphicFramePr>
+              <a:graphicFrameLocks xmlns:a="http://schemas.openxmlformats.org/drawingml/2006/main" noChangeAspect="1"/>
+            </wp:cNvGraphicFramePr>
+            <a:graphic xmlns:a="http://schemas.openxmlformats.org/drawingml/2006/main">
+              <a:graphicData uri="http://schemas.openxmlformats.org/drawingml/2006/picture">
+                <pic:pic xmlns:pic="http://schemas.openxmlformats.org/drawingml/2006/picture">
+                  <pic:nvPicPr>
+                    <pic:cNvPr id="1021222726" name=""/>
+                    <pic:cNvPicPr/>
+                  </pic:nvPicPr>
+                  <pic:blipFill>
+                    <a:blip r:embed="rId10"/>
+                    <a:stretch>
+                      <a:fillRect/>
+                    </a:stretch>
+                  </pic:blipFill>
+                  <pic:spPr>
+                    <a:xfrm>
+                      <a:off x="0" y="0"/>
+                      <a:ext cx="5731510" cy="1649730"/>
+                    </a:xfrm>
+                    <a:prstGeom prst="rect">
+                      <a:avLst/>
+                    </a:prstGeom>
+                  </pic:spPr>
+                </pic:pic>
+              </a:graphicData>
+            </a:graphic>
+          </wp:inline>
+        </w:drawing>
+      </w:r>
+    </w:p>
+    <w:p>
+      <w:r>
+        <w:drawing>
+          <wp:inline distT="0" distB="0" distL="0" distR="0" wp14:anchorId="6E25BBDA" wp14:editId="29ADBD2B">
+            <wp:extent cx="5731510" cy="1672590"/>
+            <wp:effectExtent l="0" t="0" r="2540" b="3810"/>
+            <wp:docPr id="1829203421" name="Picture 1"/>
+            <wp:cNvGraphicFramePr>
+              <a:graphicFrameLocks xmlns:a="http://schemas.openxmlformats.org/drawingml/2006/main" noChangeAspect="1"/>
+            </wp:cNvGraphicFramePr>
+            <a:graphic xmlns:a="http://schemas.openxmlformats.org/drawingml/2006/main">
+              <a:graphicData uri="http://schemas.openxmlformats.org/drawingml/2006/picture">
+                <pic:pic xmlns:pic="http://schemas.openxmlformats.org/drawingml/2006/picture">
+                  <pic:nvPicPr>
+                    <pic:cNvPr id="1829203421" name=""/>
+                    <pic:cNvPicPr/>
+                  </pic:nvPicPr>
+                  <pic:blipFill>
+                    <a:blip r:embed="rId11"/>
+                    <a:stretch>
+                      <a:fillRect/>
+                    </a:stretch>
+                  </pic:blipFill>
+                  <pic:spPr>
+                    <a:xfrm>
+                      <a:off x="0" y="0"/>
+                      <a:ext cx="5731510" cy="1672590"/>
+                    </a:xfrm>
+                    <a:prstGeom prst="rect">
+                      <a:avLst/>
+                    </a:prstGeom>
+                  </pic:spPr>
+                </pic:pic>
+              </a:graphicData>
+            </a:graphic>
+          </wp:inline>
+        </w:drawing>
+      </w:r>
+    </w:p>
+    <w:p>
+      <w:r>
+        <w:drawing>
+          <wp:inline distT="0" distB="0" distL="0" distR="0" wp14:anchorId="261A9818" wp14:editId="401EF949">
+            <wp:extent cx="5731510" cy="1123315"/>
+            <wp:effectExtent l="0" t="0" r="2540" b="635"/>
+            <wp:docPr id="1208818865" name="Picture 1"/>
+            <wp:cNvGraphicFramePr>
+              <a:graphicFrameLocks xmlns:a="http://schemas.openxmlformats.org/drawingml/2006/main" noChangeAspect="1"/>
+            </wp:cNvGraphicFramePr>
+            <a:graphic xmlns:a="http://schemas.openxmlformats.org/drawingml/2006/main">
+              <a:graphicData uri="http://schemas.openxmlformats.org/drawingml/2006/picture">
+                <pic:pic xmlns:pic="http://schemas.openxmlformats.org/drawingml/2006/picture">
+                  <pic:nvPicPr>
+                    <pic:cNvPr id="1208818865" name=""/>
+                    <pic:cNvPicPr/>
+                  </pic:nvPicPr>
+                  <pic:blipFill>
+                    <a:blip r:embed="rId12"/>
+                    <a:stretch>
+                      <a:fillRect/>
+                    </a:stretch>
+                  </pic:blipFill>
+                  <pic:spPr>
+                    <a:xfrm>
+                      <a:off x="0" y="0"/>
+                      <a:ext cx="5731510" cy="1123315"/>
+                    </a:xfrm>
+                    <a:prstGeom prst="rect">
+                      <a:avLst/>
+                    </a:prstGeom>
+                  </pic:spPr>
+                </pic:pic>
+              </a:graphicData>
+            </a:graphic>
+          </wp:inline>
+        </w:drawing>
+      </w:r>
+    </w:p>
+    <w:p>
+      <w:pPr>
+        <w:rPr>
+          <w:noProof/>
+        </w:rPr>
+      </w:pPr>
+      <w:r>
+        <w:drawing>
+          <wp:inline distT="0" distB="0" distL="0" distR="0" wp14:anchorId="2CAFDAB1" wp14:editId="53D7B0D8">
+            <wp:extent cx="5731510" cy="1186180"/>
+            <wp:effectExtent l="0" t="0" r="2540" b="0"/>
+            <wp:docPr id="356026638" name="Picture 1"/>
+            <wp:cNvGraphicFramePr>
+              <a:graphicFrameLocks xmlns:a="http://schemas.openxmlformats.org/drawingml/2006/main" noChangeAspect="1"/>
+            </wp:cNvGraphicFramePr>
+            <a:graphic xmlns:a="http://schemas.openxmlformats.org/drawingml/2006/main">
+              <a:graphicData uri="http://schemas.openxmlformats.org/drawingml/2006/picture">
+                <pic:pic xmlns:pic="http://schemas.openxmlformats.org/drawingml/2006/picture">
+                  <pic:nvPicPr>
+                    <pic:cNvPr id="356026638" name=""/>
+                    <pic:cNvPicPr/>
+                  </pic:nvPicPr>
+                  <pic:blipFill>
+                    <a:blip r:embed="rId13"/>
+                    <a:stretch>
+                      <a:fillRect/>
+                    </a:stretch>
+                  </pic:blipFill>
+                  <pic:spPr>
+                    <a:xfrm>
+                      <a:off x="0" y="0"/>
+                      <a:ext cx="5731510" cy="1186180"/>
+                    </a:xfrm>
+                    <a:prstGeom prst="rect">
+                      <a:avLst/>
+                    </a:prstGeom>
+                  </pic:spPr>
+                </pic:pic>
+              </a:graphicData>
+            </a:graphic>
+          </wp:inline>
+        </w:drawing>
+      </w:r>
+      <w:r>
+        <w:rPr>
+          <w:noProof/>
+        </w:rPr>
+        <w:t xml:space="preserve"> </w:t>
+      </w:r>
+      <w:r>
+        <w:drawing>
+          <wp:inline distT="0" distB="0" distL="0" distR="0" wp14:anchorId="4DC8F5CA" wp14:editId="604A0ADB">
+            <wp:extent cx="5731510" cy="2444750"/>
+            <wp:effectExtent l="0" t="0" r="2540" b="0"/>
+            <wp:docPr id="1683256682" name="Picture 1"/>
+            <wp:cNvGraphicFramePr>
+              <a:graphicFrameLocks xmlns:a="http://schemas.openxmlformats.org/drawingml/2006/main" noChangeAspect="1"/>
+            </wp:cNvGraphicFramePr>
+            <a:graphic xmlns:a="http://schemas.openxmlformats.org/drawingml/2006/main">
+              <a:graphicData uri="http://schemas.openxmlformats.org/drawingml/2006/picture">
+                <pic:pic xmlns:pic="http://schemas.openxmlformats.org/drawingml/2006/picture">
+                  <pic:nvPicPr>
+                    <pic:cNvPr id="1683256682" name=""/>
+                    <pic:cNvPicPr/>
+                  </pic:nvPicPr>
+                  <pic:blipFill>
+                    <a:blip r:embed="rId14"/>
+                    <a:stretch>
+                      <a:fillRect/>
+                    </a:stretch>
+                  </pic:blipFill>
+                  <pic:spPr>
+                    <a:xfrm>
+                      <a:off x="0" y="0"/>
+                      <a:ext cx="5731510" cy="2444750"/>
+                    </a:xfrm>
+                    <a:prstGeom prst="rect">
+                      <a:avLst/>
+                    </a:prstGeom>
+                  </pic:spPr>
+                </pic:pic>
+              </a:graphicData>
+            </a:graphic>
+          </wp:inline>
+        </w:drawing>
+      </w:r>
+    </w:p>
+    <w:p>
+      <w:r>
+        <w:lastRenderedPageBreak/>
+        <w:drawing>
+          <wp:inline distT="0" distB="0" distL="0" distR="0" wp14:anchorId="1DCE3BDF" wp14:editId="301CCAC5">
+            <wp:extent cx="5731510" cy="2422525"/>
+            <wp:effectExtent l="0" t="0" r="2540" b="0"/>
+            <wp:docPr id="1156612711" name="Picture 1"/>
+            <wp:cNvGraphicFramePr>
+              <a:graphicFrameLocks xmlns:a="http://schemas.openxmlformats.org/drawingml/2006/main" noChangeAspect="1"/>
+            </wp:cNvGraphicFramePr>
+            <a:graphic xmlns:a="http://schemas.openxmlformats.org/drawingml/2006/main">
+              <a:graphicData uri="http://schemas.openxmlformats.org/drawingml/2006/picture">
+                <pic:pic xmlns:pic="http://schemas.openxmlformats.org/drawingml/2006/picture">
+                  <pic:nvPicPr>
+                    <pic:cNvPr id="1156612711" name=""/>
+                    <pic:cNvPicPr/>
+                  </pic:nvPicPr>
+                  <pic:blipFill>
+                    <a:blip r:embed="rId15"/>
+                    <a:stretch>
+                      <a:fillRect/>
+                    </a:stretch>
+                  </pic:blipFill>
+                  <pic:spPr>
+                    <a:xfrm>
+                      <a:off x="0" y="0"/>
+                      <a:ext cx="5731510" cy="2422525"/>
                     </a:xfrm>
                     <a:prstGeom prst="rect">
                       <a:avLst/>

</xml_diff>

<commit_message>
Completed - 2.spring-rest-handson in Spring REST using Spring Boot 3
</commit_message>
<xml_diff>
--- a/Week 3/Spring REST using Spring Boot 3/spring-learn/2.Spring Handson Output.docx
+++ b/Week 3/Spring REST using Spring Boot 3/spring-learn/2.Spring Handson Output.docx
@@ -17,7 +17,7 @@
           <w:noProof/>
         </w:rPr>
         <w:drawing>
-          <wp:anchor distT="0" distB="0" distL="114300" distR="114300" simplePos="0" relativeHeight="251658240" behindDoc="0" locked="0" layoutInCell="1" allowOverlap="1" wp14:anchorId="019CFF1A" wp14:editId="4B6DE762">
+          <wp:anchor distT="0" distB="0" distL="114300" distR="114300" simplePos="0" relativeHeight="251658240" behindDoc="0" locked="0" layoutInCell="1" allowOverlap="1" wp14:anchorId="019CFF1A" wp14:editId="3DA91A80">
             <wp:simplePos x="0" y="0"/>
             <wp:positionH relativeFrom="margin">
               <wp:align>center</wp:align>
@@ -376,6 +376,9 @@
     </w:p>
     <w:p>
       <w:r>
+        <w:rPr>
+          <w:noProof/>
+        </w:rPr>
         <w:drawing>
           <wp:inline distT="0" distB="0" distL="0" distR="0" wp14:anchorId="79E704B8" wp14:editId="41E691AB">
             <wp:extent cx="5731510" cy="1649730"/>
@@ -415,6 +418,9 @@
     </w:p>
     <w:p>
       <w:r>
+        <w:rPr>
+          <w:noProof/>
+        </w:rPr>
         <w:drawing>
           <wp:inline distT="0" distB="0" distL="0" distR="0" wp14:anchorId="6E25BBDA" wp14:editId="29ADBD2B">
             <wp:extent cx="5731510" cy="1672590"/>
@@ -454,6 +460,9 @@
     </w:p>
     <w:p>
       <w:r>
+        <w:rPr>
+          <w:noProof/>
+        </w:rPr>
         <w:drawing>
           <wp:inline distT="0" distB="0" distL="0" distR="0" wp14:anchorId="261A9818" wp14:editId="401EF949">
             <wp:extent cx="5731510" cy="1123315"/>
@@ -498,6 +507,9 @@
         </w:rPr>
       </w:pPr>
       <w:r>
+        <w:rPr>
+          <w:noProof/>
+        </w:rPr>
         <w:drawing>
           <wp:inline distT="0" distB="0" distL="0" distR="0" wp14:anchorId="2CAFDAB1" wp14:editId="53D7B0D8">
             <wp:extent cx="5731510" cy="1186180"/>
@@ -541,6 +553,9 @@
         <w:t xml:space="preserve"> </w:t>
       </w:r>
       <w:r>
+        <w:rPr>
+          <w:noProof/>
+        </w:rPr>
         <w:drawing>
           <wp:inline distT="0" distB="0" distL="0" distR="0" wp14:anchorId="4DC8F5CA" wp14:editId="604A0ADB">
             <wp:extent cx="5731510" cy="2444750"/>
@@ -579,8 +594,31 @@
       </w:r>
     </w:p>
     <w:p>
-      <w:r>
-        <w:lastRenderedPageBreak/>
+      <w:pPr>
+        <w:rPr>
+          <w:noProof/>
+        </w:rPr>
+      </w:pPr>
+    </w:p>
+    <w:p>
+      <w:pPr>
+        <w:rPr>
+          <w:noProof/>
+        </w:rPr>
+      </w:pPr>
+    </w:p>
+    <w:p>
+      <w:pPr>
+        <w:rPr>
+          <w:noProof/>
+        </w:rPr>
+      </w:pPr>
+    </w:p>
+    <w:p>
+      <w:r>
+        <w:rPr>
+          <w:noProof/>
+        </w:rPr>
         <w:drawing>
           <wp:inline distT="0" distB="0" distL="0" distR="0" wp14:anchorId="1DCE3BDF" wp14:editId="301CCAC5">
             <wp:extent cx="5731510" cy="2422525"/>
@@ -606,6 +644,292 @@
                     <a:xfrm>
                       <a:off x="0" y="0"/>
                       <a:ext cx="5731510" cy="2422525"/>
+                    </a:xfrm>
+                    <a:prstGeom prst="rect">
+                      <a:avLst/>
+                    </a:prstGeom>
+                  </pic:spPr>
+                </pic:pic>
+              </a:graphicData>
+            </a:graphic>
+          </wp:inline>
+        </w:drawing>
+      </w:r>
+    </w:p>
+    <w:p/>
+    <w:p/>
+    <w:p/>
+    <w:p/>
+    <w:p/>
+    <w:p/>
+    <w:p/>
+    <w:p/>
+    <w:p/>
+    <w:p/>
+    <w:p/>
+    <w:p/>
+    <w:p/>
+    <w:p/>
+    <w:p/>
+    <w:p/>
+    <w:p/>
+    <w:p/>
+    <w:p/>
+    <w:p>
+      <w:r>
+        <w:rPr>
+          <w:rFonts w:ascii="Arial" w:eastAsia="Times New Roman" w:hAnsi="Arial" w:cs="Arial"/>
+          <w:b/>
+          <w:bCs/>
+          <w:color w:val="333333"/>
+          <w:sz w:val="36"/>
+          <w:szCs w:val="36"/>
+          <w:shd w:val="clear" w:color="auto" w:fill="FFFFFF"/>
+        </w:rPr>
+        <w:lastRenderedPageBreak/>
+        <w:t>REST - Get country exceptional scenario</w:t>
+      </w:r>
+      <w:r>
+        <w:rPr>
+          <w:rFonts w:ascii="Arial" w:eastAsia="Times New Roman" w:hAnsi="Arial" w:cs="Arial"/>
+          <w:color w:val="333333"/>
+          <w:sz w:val="21"/>
+          <w:szCs w:val="21"/>
+          <w:shd w:val="clear" w:color="auto" w:fill="FFFFFF"/>
+        </w:rPr>
+        <w:t> </w:t>
+      </w:r>
+    </w:p>
+    <w:p/>
+    <w:p>
+      <w:r>
+        <w:rPr>
+          <w:noProof/>
+        </w:rPr>
+        <w:drawing>
+          <wp:inline distT="0" distB="0" distL="0" distR="0" wp14:anchorId="58CAFF18" wp14:editId="522CB5F4">
+            <wp:extent cx="5731510" cy="3217545"/>
+            <wp:effectExtent l="0" t="0" r="2540" b="1905"/>
+            <wp:docPr id="995363528" name="Picture 1"/>
+            <wp:cNvGraphicFramePr>
+              <a:graphicFrameLocks xmlns:a="http://schemas.openxmlformats.org/drawingml/2006/main" noChangeAspect="1"/>
+            </wp:cNvGraphicFramePr>
+            <a:graphic xmlns:a="http://schemas.openxmlformats.org/drawingml/2006/main">
+              <a:graphicData uri="http://schemas.openxmlformats.org/drawingml/2006/picture">
+                <pic:pic xmlns:pic="http://schemas.openxmlformats.org/drawingml/2006/picture">
+                  <pic:nvPicPr>
+                    <pic:cNvPr id="995363528" name=""/>
+                    <pic:cNvPicPr/>
+                  </pic:nvPicPr>
+                  <pic:blipFill>
+                    <a:blip r:embed="rId16"/>
+                    <a:stretch>
+                      <a:fillRect/>
+                    </a:stretch>
+                  </pic:blipFill>
+                  <pic:spPr>
+                    <a:xfrm>
+                      <a:off x="0" y="0"/>
+                      <a:ext cx="5731510" cy="3217545"/>
+                    </a:xfrm>
+                    <a:prstGeom prst="rect">
+                      <a:avLst/>
+                    </a:prstGeom>
+                  </pic:spPr>
+                </pic:pic>
+              </a:graphicData>
+            </a:graphic>
+          </wp:inline>
+        </w:drawing>
+      </w:r>
+    </w:p>
+    <w:p>
+      <w:r>
+        <w:rPr>
+          <w:noProof/>
+        </w:rPr>
+        <w:drawing>
+          <wp:inline distT="0" distB="0" distL="0" distR="0" wp14:anchorId="1B45CD8C" wp14:editId="1619A2AF">
+            <wp:extent cx="5731510" cy="3217545"/>
+            <wp:effectExtent l="0" t="0" r="2540" b="1905"/>
+            <wp:docPr id="751505919" name="Picture 1"/>
+            <wp:cNvGraphicFramePr>
+              <a:graphicFrameLocks xmlns:a="http://schemas.openxmlformats.org/drawingml/2006/main" noChangeAspect="1"/>
+            </wp:cNvGraphicFramePr>
+            <a:graphic xmlns:a="http://schemas.openxmlformats.org/drawingml/2006/main">
+              <a:graphicData uri="http://schemas.openxmlformats.org/drawingml/2006/picture">
+                <pic:pic xmlns:pic="http://schemas.openxmlformats.org/drawingml/2006/picture">
+                  <pic:nvPicPr>
+                    <pic:cNvPr id="751505919" name=""/>
+                    <pic:cNvPicPr/>
+                  </pic:nvPicPr>
+                  <pic:blipFill>
+                    <a:blip r:embed="rId17"/>
+                    <a:stretch>
+                      <a:fillRect/>
+                    </a:stretch>
+                  </pic:blipFill>
+                  <pic:spPr>
+                    <a:xfrm>
+                      <a:off x="0" y="0"/>
+                      <a:ext cx="5731510" cy="3217545"/>
+                    </a:xfrm>
+                    <a:prstGeom prst="rect">
+                      <a:avLst/>
+                    </a:prstGeom>
+                  </pic:spPr>
+                </pic:pic>
+              </a:graphicData>
+            </a:graphic>
+          </wp:inline>
+        </w:drawing>
+      </w:r>
+    </w:p>
+    <w:p/>
+    <w:p/>
+    <w:p/>
+    <w:p/>
+    <w:p/>
+    <w:p>
+      <w:pPr>
+        <w:rPr>
+          <w:rFonts w:ascii="Arial" w:eastAsia="Times New Roman" w:hAnsi="Arial" w:cs="Arial"/>
+          <w:color w:val="333333"/>
+          <w:sz w:val="21"/>
+          <w:szCs w:val="21"/>
+          <w:shd w:val="clear" w:color="auto" w:fill="FFFFFF"/>
+        </w:rPr>
+      </w:pPr>
+      <w:r>
+        <w:rPr>
+          <w:rFonts w:ascii="Arial" w:eastAsia="Times New Roman" w:hAnsi="Arial" w:cs="Arial"/>
+          <w:b/>
+          <w:bCs/>
+          <w:color w:val="333333"/>
+          <w:sz w:val="36"/>
+          <w:szCs w:val="36"/>
+          <w:shd w:val="clear" w:color="auto" w:fill="FFFFFF"/>
+        </w:rPr>
+        <w:lastRenderedPageBreak/>
+        <w:t>MockMVC - Test get country service</w:t>
+      </w:r>
+      <w:r>
+        <w:rPr>
+          <w:rFonts w:ascii="Arial" w:eastAsia="Times New Roman" w:hAnsi="Arial" w:cs="Arial"/>
+          <w:color w:val="333333"/>
+          <w:sz w:val="21"/>
+          <w:szCs w:val="21"/>
+          <w:shd w:val="clear" w:color="auto" w:fill="FFFFFF"/>
+        </w:rPr>
+        <w:t> </w:t>
+      </w:r>
+    </w:p>
+    <w:p>
+      <w:r>
+        <w:rPr>
+          <w:noProof/>
+        </w:rPr>
+        <w:drawing>
+          <wp:inline distT="0" distB="0" distL="0" distR="0" wp14:anchorId="7E387409" wp14:editId="60C919A3">
+            <wp:extent cx="5731510" cy="3220720"/>
+            <wp:effectExtent l="0" t="0" r="2540" b="0"/>
+            <wp:docPr id="1338981" name="Picture 1"/>
+            <wp:cNvGraphicFramePr>
+              <a:graphicFrameLocks xmlns:a="http://schemas.openxmlformats.org/drawingml/2006/main" noChangeAspect="1"/>
+            </wp:cNvGraphicFramePr>
+            <a:graphic xmlns:a="http://schemas.openxmlformats.org/drawingml/2006/main">
+              <a:graphicData uri="http://schemas.openxmlformats.org/drawingml/2006/picture">
+                <pic:pic xmlns:pic="http://schemas.openxmlformats.org/drawingml/2006/picture">
+                  <pic:nvPicPr>
+                    <pic:cNvPr id="1338981" name=""/>
+                    <pic:cNvPicPr/>
+                  </pic:nvPicPr>
+                  <pic:blipFill>
+                    <a:blip r:embed="rId18"/>
+                    <a:stretch>
+                      <a:fillRect/>
+                    </a:stretch>
+                  </pic:blipFill>
+                  <pic:spPr>
+                    <a:xfrm>
+                      <a:off x="0" y="0"/>
+                      <a:ext cx="5731510" cy="3220720"/>
+                    </a:xfrm>
+                    <a:prstGeom prst="rect">
+                      <a:avLst/>
+                    </a:prstGeom>
+                  </pic:spPr>
+                </pic:pic>
+              </a:graphicData>
+            </a:graphic>
+          </wp:inline>
+        </w:drawing>
+      </w:r>
+    </w:p>
+    <w:p/>
+    <w:p>
+      <w:pPr>
+        <w:rPr>
+          <w:rFonts w:ascii="Arial" w:eastAsia="Times New Roman" w:hAnsi="Arial" w:cs="Arial"/>
+          <w:color w:val="333333"/>
+          <w:sz w:val="21"/>
+          <w:szCs w:val="21"/>
+          <w:shd w:val="clear" w:color="auto" w:fill="FFFFFF"/>
+        </w:rPr>
+      </w:pPr>
+      <w:r>
+        <w:rPr>
+          <w:rFonts w:ascii="Arial" w:eastAsia="Times New Roman" w:hAnsi="Arial" w:cs="Arial"/>
+          <w:b/>
+          <w:bCs/>
+          <w:color w:val="333333"/>
+          <w:sz w:val="36"/>
+          <w:szCs w:val="36"/>
+          <w:shd w:val="clear" w:color="auto" w:fill="FFFFFF"/>
+        </w:rPr>
+        <w:t>MockMVC - Test get country service for exceptional scenario</w:t>
+      </w:r>
+      <w:r>
+        <w:rPr>
+          <w:rFonts w:ascii="Arial" w:eastAsia="Times New Roman" w:hAnsi="Arial" w:cs="Arial"/>
+          <w:color w:val="333333"/>
+          <w:sz w:val="21"/>
+          <w:szCs w:val="21"/>
+          <w:shd w:val="clear" w:color="auto" w:fill="FFFFFF"/>
+        </w:rPr>
+        <w:t> </w:t>
+      </w:r>
+    </w:p>
+    <w:p>
+      <w:r>
+        <w:rPr>
+          <w:noProof/>
+        </w:rPr>
+        <w:drawing>
+          <wp:inline distT="0" distB="0" distL="0" distR="0" wp14:anchorId="40ABDF03" wp14:editId="5839D4E4">
+            <wp:extent cx="5731510" cy="3220720"/>
+            <wp:effectExtent l="0" t="0" r="2540" b="0"/>
+            <wp:docPr id="1289511084" name="Picture 1"/>
+            <wp:cNvGraphicFramePr>
+              <a:graphicFrameLocks xmlns:a="http://schemas.openxmlformats.org/drawingml/2006/main" noChangeAspect="1"/>
+            </wp:cNvGraphicFramePr>
+            <a:graphic xmlns:a="http://schemas.openxmlformats.org/drawingml/2006/main">
+              <a:graphicData uri="http://schemas.openxmlformats.org/drawingml/2006/picture">
+                <pic:pic xmlns:pic="http://schemas.openxmlformats.org/drawingml/2006/picture">
+                  <pic:nvPicPr>
+                    <pic:cNvPr id="1289511084" name=""/>
+                    <pic:cNvPicPr/>
+                  </pic:nvPicPr>
+                  <pic:blipFill>
+                    <a:blip r:embed="rId19"/>
+                    <a:stretch>
+                      <a:fillRect/>
+                    </a:stretch>
+                  </pic:blipFill>
+                  <pic:spPr>
+                    <a:xfrm>
+                      <a:off x="0" y="0"/>
+                      <a:ext cx="5731510" cy="3220720"/>
                     </a:xfrm>
                     <a:prstGeom prst="rect">
                       <a:avLst/>

</xml_diff>